<commit_message>
Gestion des Lubs par warehouse shipment
</commit_message>
<xml_diff>
--- a/Source/Report/Layout/SalesInvoiceEmail.docx
+++ b/Source/Report/Layout/SalesInvoiceEmail.docx
@@ -2165,9 +2165,9 @@
  
          < C o m p a n y P h o n e N o _ L b l > C o m p a n y P h o n e N o _ L b l < / C o m p a n y P h o n e N o _ L b l >   
-         < C o m p a n y P i c > C o m p a n y P i c < / C o m p a n y P i c > - 
-         < C o m p a n y P i c t u r e > C o m p a n y P i c t u r e < / C o m p a n y P i c t u r e > +         < C o m p a n y P i c   / > + 
+         < C o m p a n y P i c t u r e   / >   
          < C o m p a n y R e g i s t r a t i o n N u m b e r > C o m p a n y R e g i s t r a t i o n N u m b e r < / C o m p a n y R e g i s t r a t i o n N u m b e r >   
@@ -2727,7 +2727,7 @@
  
          < P a y m e n t R e p o r t i n g A r g u m e n t >   
-             < P a y m e n t S e r v i c e L o g o > P a y m e n t S e r v i c e L o g o < / P a y m e n t S e r v i c e L o g o > +             < P a y m e n t S e r v i c e L o g o   / >   
              < P a y m e n t S e r v i c e L o g o _ U r l > P a y m e n t S e r v i c e L o g o _ U r l < / P a y m e n t S e r v i c e L o g o _ U r l >   

</xml_diff>